<commit_message>
popravki in povezave do kreditnega kalkulatorja
</commit_message>
<xml_diff>
--- a/clanki/Najcenejši potrošniški kredit.docx
+++ b/clanki/Najcenejši potrošniški kredit.docx
@@ -24,8 +24,56 @@
       <w:pPr>
         <w:spacing w:after="0" w:line="240" w:lineRule="auto"/>
         <w:rPr>
-          <w:b/>
-          <w:bCs/>
+          <w:lang w:val="sl-SI"/>
+        </w:rPr>
+      </w:pPr>
+    </w:p>
+    <w:p>
+      <w:pPr>
+        <w:spacing w:after="0" w:line="240" w:lineRule="auto"/>
+        <w:rPr>
+          <w:lang w:val="sl-SI"/>
+        </w:rPr>
+      </w:pPr>
+      <w:r>
+        <w:rPr>
+          <w:lang w:val="sl-SI"/>
+        </w:rPr>
+        <w:t>V začetku leta 2026 so obrestne mere v Sloveniji po več zaporednih znižanjih Evropske centralne banke dosegle razmeroma ugodno raven, a razlike med posameznimi bankami ostajajo presenetljivo velike. Za tipičen potrošniški kredit v višini 10.000–20.000 € lahko izbira »narobe« banke pomeni, da na koncu plačaš od 800 do celo 1.500 € več, kot bi moral – zgolj zaradi višje efektivne obrestne mere (EOM) in skritih stroškov. Hkrati pa prava izbira omogoča enake mesečne obroke kot pri dražjih ponudbah, a z bistveno nižjim skupnim zneskom vračila.</w:t>
+      </w:r>
+    </w:p>
+    <w:p>
+      <w:pPr>
+        <w:spacing w:after="0" w:line="240" w:lineRule="auto"/>
+        <w:rPr>
+          <w:lang w:val="sl-SI"/>
+        </w:rPr>
+      </w:pPr>
+      <w:r>
+        <w:rPr>
+          <w:lang w:val="sl-SI"/>
+        </w:rPr>
+        <w:t>Ljudje v Sloveniji vsako leto vzamejo za več sto milijonov evrov potrošniških kreditov – najpogosteje za prenovo stanovanja, nakup avtomobila, pohištva ali kritje nepričakovanih izdatkov. Kljub temu mnogi še vedno gledajo predvsem na oglaševano nominalno obrestno mero (npr. »že od 4,9 %«), medtem ko prava slika pokaže šele efektivna obrestna mera (EOM), ki vključuje vse obvezne stroške: provizijo za odobritev, mesečno vodenje kredita, zavarovanje in morebitne druge pristojbine.</w:t>
+      </w:r>
+    </w:p>
+    <w:p>
+      <w:pPr>
+        <w:spacing w:after="0" w:line="240" w:lineRule="auto"/>
+        <w:rPr>
+          <w:lang w:val="sl-SI"/>
+        </w:rPr>
+      </w:pPr>
+      <w:r>
+        <w:rPr>
+          <w:lang w:val="sl-SI"/>
+        </w:rPr>
+        <w:t>V tem članku ti pokažemo, kako hitro in pravilno primerjati ponudbe, katera banka je marca 2026 resnično najcenejša in kako izračunati realne mesečne obveznosti, da prihraniš čim več. Podatki temeljijo na uradni primerjavi Banke Slovenije (februar 2026) in aktualnih ponudbah bank na dan 10. marec 2026.</w:t>
+      </w:r>
+    </w:p>
+    <w:p>
+      <w:pPr>
+        <w:spacing w:after="0" w:line="240" w:lineRule="auto"/>
+        <w:rPr>
           <w:lang w:val="sl-SI"/>
         </w:rPr>
       </w:pPr>
@@ -640,6 +688,7 @@
                 <w:bCs/>
                 <w:lang w:val="sl-SI"/>
               </w:rPr>
+              <w:lastRenderedPageBreak/>
               <w:t>Banka / hranilnica</w:t>
             </w:r>
           </w:p>
@@ -1539,169 +1588,17 @@
           <w:b/>
           <w:bCs/>
           <w:color w:val="EE0000"/>
-          <w:lang w:val="en-SI"/>
-        </w:rPr>
-      </w:pPr>
-      <w:proofErr w:type="spellStart"/>
+          <w:lang w:val="sl-SI"/>
+        </w:rPr>
+      </w:pPr>
       <w:r>
         <w:rPr>
           <w:b/>
           <w:bCs/>
           <w:color w:val="EE0000"/>
-          <w:lang w:val="en-SI"/>
-        </w:rPr>
-        <w:lastRenderedPageBreak/>
-        <w:t>Konkretni</w:t>
-      </w:r>
-      <w:proofErr w:type="spellEnd"/>
-      <w:r>
-        <w:rPr>
-          <w:b/>
-          <w:bCs/>
-          <w:color w:val="EE0000"/>
-          <w:lang w:val="en-SI"/>
-        </w:rPr>
-        <w:t xml:space="preserve"> </w:t>
-      </w:r>
-      <w:proofErr w:type="spellStart"/>
-      <w:r>
-        <w:rPr>
-          <w:b/>
-          <w:bCs/>
-          <w:color w:val="EE0000"/>
-          <w:lang w:val="en-SI"/>
-        </w:rPr>
-        <w:t>linki</w:t>
-      </w:r>
-      <w:proofErr w:type="spellEnd"/>
-      <w:r>
-        <w:rPr>
-          <w:b/>
-          <w:bCs/>
-          <w:color w:val="EE0000"/>
-          <w:lang w:val="en-SI"/>
-        </w:rPr>
-        <w:t xml:space="preserve">, </w:t>
-      </w:r>
-      <w:proofErr w:type="spellStart"/>
-      <w:r>
-        <w:rPr>
-          <w:b/>
-          <w:bCs/>
-          <w:color w:val="EE0000"/>
-          <w:lang w:val="en-SI"/>
-        </w:rPr>
-        <w:t>kjer</w:t>
-      </w:r>
-      <w:proofErr w:type="spellEnd"/>
-      <w:r>
-        <w:rPr>
-          <w:b/>
-          <w:bCs/>
-          <w:color w:val="EE0000"/>
-          <w:lang w:val="en-SI"/>
-        </w:rPr>
-        <w:t xml:space="preserve"> </w:t>
-      </w:r>
-      <w:proofErr w:type="spellStart"/>
-      <w:r>
-        <w:rPr>
-          <w:b/>
-          <w:bCs/>
-          <w:color w:val="EE0000"/>
-          <w:lang w:val="en-SI"/>
-        </w:rPr>
-        <w:t>najdeš</w:t>
-      </w:r>
-      <w:proofErr w:type="spellEnd"/>
-      <w:r>
-        <w:rPr>
-          <w:b/>
-          <w:bCs/>
-          <w:color w:val="EE0000"/>
-          <w:lang w:val="en-SI"/>
-        </w:rPr>
-        <w:t xml:space="preserve"> </w:t>
-      </w:r>
-      <w:proofErr w:type="spellStart"/>
-      <w:r>
-        <w:rPr>
-          <w:b/>
-          <w:bCs/>
-          <w:color w:val="EE0000"/>
-          <w:lang w:val="en-SI"/>
-        </w:rPr>
-        <w:t>vse</w:t>
-      </w:r>
-      <w:proofErr w:type="spellEnd"/>
-      <w:r>
-        <w:rPr>
-          <w:b/>
-          <w:bCs/>
-          <w:color w:val="EE0000"/>
-          <w:lang w:val="en-SI"/>
-        </w:rPr>
-        <w:t xml:space="preserve"> to (</w:t>
-      </w:r>
-      <w:proofErr w:type="spellStart"/>
-      <w:r>
-        <w:rPr>
-          <w:b/>
-          <w:bCs/>
-          <w:color w:val="EE0000"/>
-          <w:lang w:val="en-SI"/>
-        </w:rPr>
-        <w:t>vključno</w:t>
-      </w:r>
-      <w:proofErr w:type="spellEnd"/>
-      <w:r>
-        <w:rPr>
-          <w:b/>
-          <w:bCs/>
-          <w:color w:val="EE0000"/>
-          <w:lang w:val="en-SI"/>
-        </w:rPr>
-        <w:t xml:space="preserve"> s </w:t>
-      </w:r>
-      <w:proofErr w:type="spellStart"/>
-      <w:r>
-        <w:rPr>
-          <w:b/>
-          <w:bCs/>
-          <w:color w:val="EE0000"/>
-          <w:lang w:val="en-SI"/>
-        </w:rPr>
-        <w:t>tabelo</w:t>
-      </w:r>
-      <w:proofErr w:type="spellEnd"/>
-      <w:r>
-        <w:rPr>
-          <w:b/>
-          <w:bCs/>
-          <w:color w:val="EE0000"/>
-          <w:lang w:val="en-SI"/>
-        </w:rPr>
-        <w:t xml:space="preserve"> 3 z EOM po </w:t>
-      </w:r>
-      <w:proofErr w:type="spellStart"/>
-      <w:r>
-        <w:rPr>
-          <w:b/>
-          <w:bCs/>
-          <w:color w:val="EE0000"/>
-          <w:lang w:val="en-SI"/>
-        </w:rPr>
-        <w:t>bankah</w:t>
-      </w:r>
-      <w:proofErr w:type="spellEnd"/>
-      <w:r>
-        <w:rPr>
-          <w:b/>
-          <w:bCs/>
-          <w:color w:val="EE0000"/>
-          <w:lang w:val="en-SI"/>
-        </w:rPr>
-        <w:t>):</w:t>
+          <w:lang w:val="sl-SI"/>
+        </w:rPr>
+        <w:t>Konkretni linki, kjer najdeš vse to (vključno s tabelo 3 z EOM po bankah):</w:t>
       </w:r>
     </w:p>
     <w:p>
@@ -1714,62 +1611,16 @@
         <w:rPr>
           <w:b/>
           <w:bCs/>
-          <w:lang w:val="en-SI"/>
-        </w:rPr>
-      </w:pPr>
-      <w:proofErr w:type="spellStart"/>
-      <w:r>
-        <w:rPr>
-          <w:b/>
-          <w:bCs/>
-          <w:lang w:val="en-SI"/>
-        </w:rPr>
-        <w:t>Glavna</w:t>
-      </w:r>
-      <w:proofErr w:type="spellEnd"/>
-      <w:r>
-        <w:rPr>
-          <w:b/>
-          <w:bCs/>
-          <w:lang w:val="en-SI"/>
-        </w:rPr>
-        <w:t xml:space="preserve"> </w:t>
-      </w:r>
-      <w:proofErr w:type="spellStart"/>
-      <w:r>
-        <w:rPr>
-          <w:b/>
-          <w:bCs/>
-          <w:lang w:val="en-SI"/>
-        </w:rPr>
-        <w:t>stran</w:t>
-      </w:r>
-      <w:proofErr w:type="spellEnd"/>
-      <w:r>
-        <w:rPr>
-          <w:b/>
-          <w:bCs/>
-          <w:lang w:val="en-SI"/>
-        </w:rPr>
-        <w:t xml:space="preserve"> </w:t>
-      </w:r>
-      <w:proofErr w:type="spellStart"/>
-      <w:r>
-        <w:rPr>
-          <w:b/>
-          <w:bCs/>
-          <w:lang w:val="en-SI"/>
-        </w:rPr>
-        <w:t>publikacije</w:t>
-      </w:r>
-      <w:proofErr w:type="spellEnd"/>
-      <w:r>
-        <w:rPr>
-          <w:b/>
-          <w:bCs/>
-          <w:lang w:val="en-SI"/>
-        </w:rPr>
-        <w:t xml:space="preserve">: </w:t>
+          <w:lang w:val="sl-SI"/>
+        </w:rPr>
+      </w:pPr>
+      <w:r>
+        <w:rPr>
+          <w:b/>
+          <w:bCs/>
+          <w:lang w:val="sl-SI"/>
+        </w:rPr>
+        <w:t xml:space="preserve">Glavna stran publikacije: </w:t>
       </w:r>
       <w:hyperlink r:id="rId5" w:tgtFrame="_blank" w:history="1">
         <w:r>
@@ -1777,7 +1628,7 @@
             <w:rStyle w:val="Hyperlink"/>
             <w:b/>
             <w:bCs/>
-            <w:lang w:val="en-SI"/>
+            <w:lang w:val="sl-SI"/>
           </w:rPr>
           <w:t>https://www.bsi.si/sl/publikacije/p/primerjava-stroskov-nekaterih-bancnih-storitev-za-potrosnike-februar-2026</w:t>
         </w:r>
@@ -1793,152 +1644,16 @@
         <w:rPr>
           <w:b/>
           <w:bCs/>
-          <w:lang w:val="en-SI"/>
-        </w:rPr>
-      </w:pPr>
-      <w:proofErr w:type="spellStart"/>
-      <w:r>
-        <w:rPr>
-          <w:b/>
-          <w:bCs/>
-          <w:lang w:val="en-SI"/>
-        </w:rPr>
-        <w:t>Neposredni</w:t>
-      </w:r>
-      <w:proofErr w:type="spellEnd"/>
-      <w:r>
-        <w:rPr>
-          <w:b/>
-          <w:bCs/>
-          <w:lang w:val="en-SI"/>
-        </w:rPr>
-        <w:t xml:space="preserve"> PDF z </w:t>
-      </w:r>
-      <w:proofErr w:type="spellStart"/>
-      <w:r>
-        <w:rPr>
-          <w:b/>
-          <w:bCs/>
-          <w:lang w:val="en-SI"/>
-        </w:rPr>
-        <w:t>vsemi</w:t>
-      </w:r>
-      <w:proofErr w:type="spellEnd"/>
-      <w:r>
-        <w:rPr>
-          <w:b/>
-          <w:bCs/>
-          <w:lang w:val="en-SI"/>
-        </w:rPr>
-        <w:t xml:space="preserve"> </w:t>
-      </w:r>
-      <w:proofErr w:type="spellStart"/>
-      <w:r>
-        <w:rPr>
-          <w:b/>
-          <w:bCs/>
-          <w:lang w:val="en-SI"/>
-        </w:rPr>
-        <w:t>tabelami</w:t>
-      </w:r>
-      <w:proofErr w:type="spellEnd"/>
-      <w:r>
-        <w:rPr>
-          <w:b/>
-          <w:bCs/>
-          <w:lang w:val="en-SI"/>
-        </w:rPr>
-        <w:t xml:space="preserve"> (</w:t>
-      </w:r>
-      <w:proofErr w:type="spellStart"/>
-      <w:r>
-        <w:rPr>
-          <w:b/>
-          <w:bCs/>
-          <w:lang w:val="en-SI"/>
-        </w:rPr>
-        <w:t>vključno</w:t>
-      </w:r>
-      <w:proofErr w:type="spellEnd"/>
-      <w:r>
-        <w:rPr>
-          <w:b/>
-          <w:bCs/>
-          <w:lang w:val="en-SI"/>
-        </w:rPr>
-        <w:t xml:space="preserve"> z </w:t>
-      </w:r>
-      <w:proofErr w:type="spellStart"/>
-      <w:r>
-        <w:rPr>
-          <w:b/>
-          <w:bCs/>
-          <w:lang w:val="en-SI"/>
-        </w:rPr>
-        <w:t>našo</w:t>
-      </w:r>
-      <w:proofErr w:type="spellEnd"/>
-      <w:r>
-        <w:rPr>
-          <w:b/>
-          <w:bCs/>
-          <w:lang w:val="en-SI"/>
-        </w:rPr>
-        <w:t xml:space="preserve"> </w:t>
-      </w:r>
-      <w:proofErr w:type="spellStart"/>
-      <w:r>
-        <w:rPr>
-          <w:b/>
-          <w:bCs/>
-          <w:lang w:val="en-SI"/>
-        </w:rPr>
-        <w:t>tabelo</w:t>
-      </w:r>
-      <w:proofErr w:type="spellEnd"/>
-      <w:r>
-        <w:rPr>
-          <w:b/>
-          <w:bCs/>
-          <w:lang w:val="en-SI"/>
-        </w:rPr>
-        <w:t xml:space="preserve"> EOM za </w:t>
-      </w:r>
-      <w:proofErr w:type="spellStart"/>
-      <w:r>
-        <w:rPr>
-          <w:b/>
-          <w:bCs/>
-          <w:lang w:val="en-SI"/>
-        </w:rPr>
-        <w:t>potrošniške</w:t>
-      </w:r>
-      <w:proofErr w:type="spellEnd"/>
-      <w:r>
-        <w:rPr>
-          <w:b/>
-          <w:bCs/>
-          <w:lang w:val="en-SI"/>
-        </w:rPr>
-        <w:t xml:space="preserve"> </w:t>
-      </w:r>
-      <w:proofErr w:type="spellStart"/>
-      <w:r>
-        <w:rPr>
-          <w:b/>
-          <w:bCs/>
-          <w:lang w:val="en-SI"/>
-        </w:rPr>
-        <w:t>kredite</w:t>
-      </w:r>
-      <w:proofErr w:type="spellEnd"/>
-      <w:r>
-        <w:rPr>
-          <w:b/>
-          <w:bCs/>
-          <w:lang w:val="en-SI"/>
-        </w:rPr>
-        <w:t xml:space="preserve">): </w:t>
+          <w:lang w:val="sl-SI"/>
+        </w:rPr>
+      </w:pPr>
+      <w:r>
+        <w:rPr>
+          <w:b/>
+          <w:bCs/>
+          <w:lang w:val="sl-SI"/>
+        </w:rPr>
+        <w:t xml:space="preserve">Neposredni PDF z vsemi tabelami (vključno z našo tabelo EOM za potrošniške kredite): </w:t>
       </w:r>
       <w:hyperlink r:id="rId6" w:tgtFrame="_blank" w:history="1">
         <w:r>
@@ -1946,7 +1661,7 @@
             <w:rStyle w:val="Hyperlink"/>
             <w:b/>
             <w:bCs/>
-            <w:lang w:val="en-SI"/>
+            <w:lang w:val="sl-SI"/>
           </w:rPr>
           <w:t>https://www.bsi.si/storage/uploads/aef4b55f-96d1-47b7-a26c-44dc321a012f/Primerjava-stro%C5%A1kov-nekaterih-ban%C4%8Dnih-storitev-za-potro%C5%A1nike_februar-2026.pdf</w:t>
         </w:r>
@@ -1955,171 +1670,9 @@
         <w:rPr>
           <w:b/>
           <w:bCs/>
-          <w:lang w:val="en-SI"/>
-        </w:rPr>
-        <w:t xml:space="preserve"> (</w:t>
-      </w:r>
-      <w:proofErr w:type="spellStart"/>
-      <w:r>
-        <w:rPr>
-          <w:b/>
-          <w:bCs/>
-          <w:lang w:val="en-SI"/>
-        </w:rPr>
-        <w:t>Tabela</w:t>
-      </w:r>
-      <w:proofErr w:type="spellEnd"/>
-      <w:r>
-        <w:rPr>
-          <w:b/>
-          <w:bCs/>
-          <w:lang w:val="en-SI"/>
-        </w:rPr>
-        <w:t xml:space="preserve"> 3 je </w:t>
-      </w:r>
-      <w:proofErr w:type="spellStart"/>
-      <w:r>
-        <w:rPr>
-          <w:b/>
-          <w:bCs/>
-          <w:lang w:val="en-SI"/>
-        </w:rPr>
-        <w:t>na</w:t>
-      </w:r>
-      <w:proofErr w:type="spellEnd"/>
-      <w:r>
-        <w:rPr>
-          <w:b/>
-          <w:bCs/>
-          <w:lang w:val="en-SI"/>
-        </w:rPr>
-        <w:t xml:space="preserve"> </w:t>
-      </w:r>
-      <w:proofErr w:type="spellStart"/>
-      <w:r>
-        <w:rPr>
-          <w:b/>
-          <w:bCs/>
-          <w:lang w:val="en-SI"/>
-        </w:rPr>
-        <w:t>strani</w:t>
-      </w:r>
-      <w:proofErr w:type="spellEnd"/>
-      <w:r>
-        <w:rPr>
-          <w:b/>
-          <w:bCs/>
-          <w:lang w:val="en-SI"/>
-        </w:rPr>
-        <w:t xml:space="preserve"> 10 PDF-</w:t>
-      </w:r>
-      <w:proofErr w:type="spellStart"/>
-      <w:r>
-        <w:rPr>
-          <w:b/>
-          <w:bCs/>
-          <w:lang w:val="en-SI"/>
-        </w:rPr>
-        <w:t>ja</w:t>
-      </w:r>
-      <w:proofErr w:type="spellEnd"/>
-      <w:r>
-        <w:rPr>
-          <w:b/>
-          <w:bCs/>
-          <w:lang w:val="en-SI"/>
-        </w:rPr>
-        <w:t xml:space="preserve"> – tam so </w:t>
-      </w:r>
-      <w:proofErr w:type="spellStart"/>
-      <w:r>
-        <w:rPr>
-          <w:b/>
-          <w:bCs/>
-          <w:lang w:val="en-SI"/>
-        </w:rPr>
-        <w:t>navedene</w:t>
-      </w:r>
-      <w:proofErr w:type="spellEnd"/>
-      <w:r>
-        <w:rPr>
-          <w:b/>
-          <w:bCs/>
-          <w:lang w:val="en-SI"/>
-        </w:rPr>
-        <w:t xml:space="preserve"> </w:t>
-      </w:r>
-      <w:proofErr w:type="spellStart"/>
-      <w:r>
-        <w:rPr>
-          <w:b/>
-          <w:bCs/>
-          <w:lang w:val="en-SI"/>
-        </w:rPr>
-        <w:t>vse</w:t>
-      </w:r>
-      <w:proofErr w:type="spellEnd"/>
-      <w:r>
-        <w:rPr>
-          <w:b/>
-          <w:bCs/>
-          <w:lang w:val="en-SI"/>
-        </w:rPr>
-        <w:t xml:space="preserve"> </w:t>
-      </w:r>
-      <w:proofErr w:type="spellStart"/>
-      <w:r>
-        <w:rPr>
-          <w:b/>
-          <w:bCs/>
-          <w:lang w:val="en-SI"/>
-        </w:rPr>
-        <w:t>banke</w:t>
-      </w:r>
-      <w:proofErr w:type="spellEnd"/>
-      <w:r>
-        <w:rPr>
-          <w:b/>
-          <w:bCs/>
-          <w:lang w:val="en-SI"/>
-        </w:rPr>
-        <w:t xml:space="preserve">, EOM, </w:t>
-      </w:r>
-      <w:proofErr w:type="spellStart"/>
-      <w:r>
-        <w:rPr>
-          <w:b/>
-          <w:bCs/>
-          <w:lang w:val="en-SI"/>
-        </w:rPr>
-        <w:t>odstopanja</w:t>
-      </w:r>
-      <w:proofErr w:type="spellEnd"/>
-      <w:r>
-        <w:rPr>
-          <w:b/>
-          <w:bCs/>
-          <w:lang w:val="en-SI"/>
-        </w:rPr>
-        <w:t xml:space="preserve"> </w:t>
-      </w:r>
-      <w:proofErr w:type="spellStart"/>
-      <w:r>
-        <w:rPr>
-          <w:b/>
-          <w:bCs/>
-          <w:lang w:val="en-SI"/>
-        </w:rPr>
-        <w:t>itd</w:t>
-      </w:r>
-      <w:proofErr w:type="spellEnd"/>
-      <w:r>
-        <w:rPr>
-          <w:b/>
-          <w:bCs/>
-          <w:lang w:val="en-SI"/>
-        </w:rPr>
-        <w:t>.)</w:t>
+          <w:lang w:val="sl-SI"/>
+        </w:rPr>
+        <w:t xml:space="preserve"> (Tabela 3 je na strani 10 PDF-ja – tam so navedene vse banke, EOM, odstopanja itd.)</w:t>
       </w:r>
     </w:p>
     <w:p>
@@ -2549,6 +2102,7 @@
           <w:bCs/>
           <w:lang w:val="sl-SI"/>
         </w:rPr>
+        <w:lastRenderedPageBreak/>
         <w:t>Zaključek: Ne hitite, primerjajte EOM!</w:t>
       </w:r>
     </w:p>

</xml_diff>